<commit_message>
test: verify repaired WPS cold start
</commit_message>
<xml_diff>
--- a/验收/模拟客户A/模拟标段1/导出/技术标-模拟标段1.docx
+++ b/验收/模拟客户A/模拟标段1/导出/技术标-模拟标段1.docx
@@ -6,8 +6,8 @@
       <w:pPr>
         <w:spacing w:line="5200" w:lineRule="exact"/>
         <w:rPr>
-          <w:rFonts w:hint="default"/>
-          <w:lang w:val="en-US"/>
+          <w:rFonts w:hint="eastAsia" w:eastAsiaTheme="minorEastAsia"/>
+          <w:lang w:val="en-US" w:eastAsia="zh-CN"/>
         </w:rPr>
       </w:pPr>
     </w:p>
@@ -16,14 +16,14 @@
         <w:pStyle w:val="7"/>
         <w:bidi w:val="0"/>
         <w:rPr>
-          <w:rFonts w:hint="default"/>
-          <w:lang w:val="en-US"/>
-        </w:rPr>
-      </w:pPr>
-      <w:r>
-        <w:rPr>
-          <w:rFonts w:hint="default"/>
-          <w:lang w:val="en-US"/>
+          <w:rFonts w:hint="eastAsia"/>
+          <w:lang w:val="en-US" w:eastAsia="zh-CN"/>
+        </w:rPr>
+      </w:pPr>
+      <w:r>
+        <w:rPr>
+          <w:rFonts w:hint="eastAsia"/>
+          <w:lang w:val="en-US" w:eastAsia="zh-CN"/>
         </w:rPr>
         <w:t>2. 总体技术方案【P01】</w:t>
       </w:r>
@@ -31,14 +31,14 @@
     <w:p>
       <w:pPr>
         <w:rPr>
-          <w:rFonts w:hint="default"/>
-          <w:lang w:val="en-US"/>
-        </w:rPr>
-      </w:pPr>
-      <w:r>
-        <w:rPr>
-          <w:rFonts w:hint="default"/>
-          <w:lang w:val="en-US"/>
+          <w:rFonts w:hint="eastAsia"/>
+          <w:lang w:val="en-US" w:eastAsia="zh-CN"/>
+        </w:rPr>
+      </w:pPr>
+      <w:r>
+        <w:rPr>
+          <w:rFonts w:hint="eastAsia"/>
+          <w:lang w:val="en-US" w:eastAsia="zh-CN"/>
         </w:rPr>
         <w:t xml:space="preserve"> </w:t>
       </w:r>
@@ -46,14 +46,14 @@
     <w:p>
       <w:pPr>
         <w:rPr>
-          <w:rFonts w:hint="default"/>
-          <w:lang w:val="en-US"/>
-        </w:rPr>
-      </w:pPr>
-      <w:r>
-        <w:rPr>
-          <w:rFonts w:hint="default"/>
-          <w:lang w:val="en-US"/>
+          <w:rFonts w:hint="eastAsia"/>
+          <w:lang w:val="en-US" w:eastAsia="zh-CN"/>
+        </w:rPr>
+      </w:pPr>
+      <w:r>
+        <w:rPr>
+          <w:rFonts w:hint="eastAsia"/>
+          <w:lang w:val="en-US" w:eastAsia="zh-CN"/>
         </w:rPr>
         <w:br w:type="page"/>
       </w:r>
@@ -65,17 +65,17 @@
         <w:spacing w:after="100" w:line="360" w:lineRule="auto"/>
         <w:jc w:val="center"/>
         <w:rPr>
-          <w:rFonts w:hint="default"/>
-          <w:lang w:val="en-US"/>
-        </w:rPr>
-      </w:pPr>
-      <w:r>
-        <w:rPr>
-          <w:rFonts w:hint="default"/>
+          <w:rFonts w:hint="eastAsia"/>
+          <w:lang w:val="en-US" w:eastAsia="zh-CN"/>
+        </w:rPr>
+      </w:pPr>
+      <w:r>
+        <w:rPr>
+          <w:rFonts w:hint="eastAsia"/>
           <w:b w:val="0"/>
           <w:color w:val="000000"/>
           <w:sz w:val="36"/>
-          <w:lang w:val="en-US"/>
+          <w:lang w:val="en-US" w:eastAsia="zh-CN"/>
         </w:rPr>
         <w:t>目  录</w:t>
       </w:r>
@@ -89,50 +89,50 @@
       </w:pPr>
       <w:r>
         <w:rPr>
-          <w:rFonts w:hint="default"/>
-          <w:lang w:val="en-US"/>
+          <w:rFonts w:hint="eastAsia"/>
+          <w:lang w:val="en-US" w:eastAsia="zh-CN"/>
         </w:rPr>
         <w:fldChar w:fldCharType="begin"/>
       </w:r>
       <w:r>
         <w:rPr>
-          <w:rFonts w:hint="default"/>
-          <w:lang w:val="en-US"/>
+          <w:rFonts w:hint="eastAsia"/>
+          <w:lang w:val="en-US" w:eastAsia="zh-CN"/>
         </w:rPr>
         <w:instrText xml:space="preserve">TOC \o "1-3" \h \z</w:instrText>
       </w:r>
       <w:r>
         <w:rPr>
-          <w:rFonts w:hint="default"/>
-          <w:lang w:val="en-US"/>
+          <w:rFonts w:hint="eastAsia"/>
+          <w:lang w:val="en-US" w:eastAsia="zh-CN"/>
         </w:rPr>
         <w:fldChar w:fldCharType="separate"/>
       </w:r>
       <w:r>
         <w:rPr>
-          <w:rFonts w:hint="default"/>
-          <w:lang w:val="en-US"/>
+          <w:rFonts w:hint="eastAsia"/>
+          <w:lang w:val="en-US" w:eastAsia="zh-CN"/>
         </w:rPr>
         <w:fldChar w:fldCharType="begin"/>
       </w:r>
       <w:r>
         <w:rPr>
-          <w:rFonts w:hint="default"/>
-          <w:lang w:val="en-US"/>
-        </w:rPr>
-        <w:instrText xml:space="preserve"> HYPERLINK \l _Toc1487999153 </w:instrText>
-      </w:r>
-      <w:r>
-        <w:rPr>
-          <w:rFonts w:hint="default"/>
-          <w:lang w:val="en-US"/>
+          <w:rFonts w:hint="eastAsia"/>
+          <w:lang w:val="en-US" w:eastAsia="zh-CN"/>
+        </w:rPr>
+        <w:instrText xml:space="preserve"> HYPERLINK \l _Toc922968883 </w:instrText>
+      </w:r>
+      <w:r>
+        <w:rPr>
+          <w:rFonts w:hint="eastAsia"/>
+          <w:lang w:val="en-US" w:eastAsia="zh-CN"/>
         </w:rPr>
         <w:fldChar w:fldCharType="separate"/>
       </w:r>
       <w:r>
         <w:rPr>
-          <w:rFonts w:hint="default"/>
-          <w:lang w:val="en-US"/>
+          <w:rFonts w:hint="eastAsia"/>
+          <w:lang w:val="en-US" w:eastAsia="zh-CN"/>
         </w:rPr>
         <w:t>2. 总体技术方案【P01】</w:t>
       </w:r>
@@ -143,7 +143,7 @@
         <w:fldChar w:fldCharType="begin"/>
       </w:r>
       <w:r>
-        <w:instrText xml:space="preserve"> PAGEREF _Toc1487999153 \h </w:instrText>
+        <w:instrText xml:space="preserve"> PAGEREF _Toc922968883 \h </w:instrText>
       </w:r>
       <w:r>
         <w:fldChar w:fldCharType="separate"/>
@@ -156,8 +156,8 @@
       </w:r>
       <w:r>
         <w:rPr>
-          <w:rFonts w:hint="default"/>
-          <w:lang w:val="en-US"/>
+          <w:rFonts w:hint="eastAsia"/>
+          <w:lang w:val="en-US" w:eastAsia="zh-CN"/>
         </w:rPr>
         <w:fldChar w:fldCharType="end"/>
       </w:r>
@@ -171,29 +171,29 @@
       </w:pPr>
       <w:r>
         <w:rPr>
-          <w:rFonts w:hint="default"/>
-          <w:lang w:val="en-US"/>
+          <w:rFonts w:hint="eastAsia"/>
+          <w:lang w:val="en-US" w:eastAsia="zh-CN"/>
         </w:rPr>
         <w:fldChar w:fldCharType="begin"/>
       </w:r>
       <w:r>
         <w:rPr>
-          <w:rFonts w:hint="default"/>
-          <w:lang w:val="en-US"/>
-        </w:rPr>
-        <w:instrText xml:space="preserve"> HYPERLINK \l _Toc1354695156 </w:instrText>
-      </w:r>
-      <w:r>
-        <w:rPr>
-          <w:rFonts w:hint="default"/>
-          <w:lang w:val="en-US"/>
+          <w:rFonts w:hint="eastAsia"/>
+          <w:lang w:val="en-US" w:eastAsia="zh-CN"/>
+        </w:rPr>
+        <w:instrText xml:space="preserve"> HYPERLINK \l _Toc1063634300 </w:instrText>
+      </w:r>
+      <w:r>
+        <w:rPr>
+          <w:rFonts w:hint="eastAsia"/>
+          <w:lang w:val="en-US" w:eastAsia="zh-CN"/>
         </w:rPr>
         <w:fldChar w:fldCharType="separate"/>
       </w:r>
       <w:r>
         <w:rPr>
-          <w:rFonts w:hint="default"/>
-          <w:lang w:val="en-US"/>
+          <w:rFonts w:hint="eastAsia"/>
+          <w:lang w:val="en-US" w:eastAsia="zh-CN"/>
         </w:rPr>
         <w:t>3. 数据平台架构与国产化适配【P02】</w:t>
       </w:r>
@@ -204,7 +204,7 @@
         <w:fldChar w:fldCharType="begin"/>
       </w:r>
       <w:r>
-        <w:instrText xml:space="preserve"> PAGEREF _Toc1354695156 \h </w:instrText>
+        <w:instrText xml:space="preserve"> PAGEREF _Toc1063634300 \h </w:instrText>
       </w:r>
       <w:r>
         <w:fldChar w:fldCharType="separate"/>
@@ -217,8 +217,8 @@
       </w:r>
       <w:r>
         <w:rPr>
-          <w:rFonts w:hint="default"/>
-          <w:lang w:val="en-US"/>
+          <w:rFonts w:hint="eastAsia"/>
+          <w:lang w:val="en-US" w:eastAsia="zh-CN"/>
         </w:rPr>
         <w:fldChar w:fldCharType="end"/>
       </w:r>
@@ -232,29 +232,29 @@
       </w:pPr>
       <w:r>
         <w:rPr>
-          <w:rFonts w:hint="default"/>
-          <w:lang w:val="en-US"/>
+          <w:rFonts w:hint="eastAsia"/>
+          <w:lang w:val="en-US" w:eastAsia="zh-CN"/>
         </w:rPr>
         <w:fldChar w:fldCharType="begin"/>
       </w:r>
       <w:r>
         <w:rPr>
-          <w:rFonts w:hint="default"/>
-          <w:lang w:val="en-US"/>
-        </w:rPr>
-        <w:instrText xml:space="preserve"> HYPERLINK \l _Toc739861398 </w:instrText>
-      </w:r>
-      <w:r>
-        <w:rPr>
-          <w:rFonts w:hint="default"/>
-          <w:lang w:val="en-US"/>
+          <w:rFonts w:hint="eastAsia"/>
+          <w:lang w:val="en-US" w:eastAsia="zh-CN"/>
+        </w:rPr>
+        <w:instrText xml:space="preserve"> HYPERLINK \l _Toc847802472 </w:instrText>
+      </w:r>
+      <w:r>
+        <w:rPr>
+          <w:rFonts w:hint="eastAsia"/>
+          <w:lang w:val="en-US" w:eastAsia="zh-CN"/>
         </w:rPr>
         <w:fldChar w:fldCharType="separate"/>
       </w:r>
       <w:r>
         <w:rPr>
-          <w:rFonts w:hint="default"/>
-          <w:lang w:val="en-US"/>
+          <w:rFonts w:hint="eastAsia"/>
+          <w:lang w:val="en-US" w:eastAsia="zh-CN"/>
         </w:rPr>
         <w:t>4. 实施与保障方案【P02 辅助】</w:t>
       </w:r>
@@ -265,7 +265,7 @@
         <w:fldChar w:fldCharType="begin"/>
       </w:r>
       <w:r>
-        <w:instrText xml:space="preserve"> PAGEREF _Toc739861398 \h </w:instrText>
+        <w:instrText xml:space="preserve"> PAGEREF _Toc847802472 \h </w:instrText>
       </w:r>
       <w:r>
         <w:fldChar w:fldCharType="separate"/>
@@ -278,8 +278,8 @@
       </w:r>
       <w:r>
         <w:rPr>
-          <w:rFonts w:hint="default"/>
-          <w:lang w:val="en-US"/>
+          <w:rFonts w:hint="eastAsia"/>
+          <w:lang w:val="en-US" w:eastAsia="zh-CN"/>
         </w:rPr>
         <w:fldChar w:fldCharType="end"/>
       </w:r>
@@ -293,29 +293,29 @@
       </w:pPr>
       <w:r>
         <w:rPr>
-          <w:rFonts w:hint="default"/>
-          <w:lang w:val="en-US"/>
+          <w:rFonts w:hint="eastAsia"/>
+          <w:lang w:val="en-US" w:eastAsia="zh-CN"/>
         </w:rPr>
         <w:fldChar w:fldCharType="begin"/>
       </w:r>
       <w:r>
         <w:rPr>
-          <w:rFonts w:hint="default"/>
-          <w:lang w:val="en-US"/>
-        </w:rPr>
-        <w:instrText xml:space="preserve"> HYPERLINK \l _Toc920200056 </w:instrText>
-      </w:r>
-      <w:r>
-        <w:rPr>
-          <w:rFonts w:hint="default"/>
-          <w:lang w:val="en-US"/>
+          <w:rFonts w:hint="eastAsia"/>
+          <w:lang w:val="en-US" w:eastAsia="zh-CN"/>
+        </w:rPr>
+        <w:instrText xml:space="preserve"> HYPERLINK \l _Toc462149059 </w:instrText>
+      </w:r>
+      <w:r>
+        <w:rPr>
+          <w:rFonts w:hint="eastAsia"/>
+          <w:lang w:val="en-US" w:eastAsia="zh-CN"/>
         </w:rPr>
         <w:fldChar w:fldCharType="separate"/>
       </w:r>
       <w:r>
         <w:rPr>
-          <w:rFonts w:hint="default"/>
-          <w:lang w:val="en-US"/>
+          <w:rFonts w:hint="eastAsia"/>
+          <w:lang w:val="en-US" w:eastAsia="zh-CN"/>
         </w:rPr>
         <w:t>5. 项目团队与类似业绩【P03】</w:t>
       </w:r>
@@ -326,7 +326,7 @@
         <w:fldChar w:fldCharType="begin"/>
       </w:r>
       <w:r>
-        <w:instrText xml:space="preserve"> PAGEREF _Toc920200056 \h </w:instrText>
+        <w:instrText xml:space="preserve"> PAGEREF _Toc462149059 \h </w:instrText>
       </w:r>
       <w:r>
         <w:fldChar w:fldCharType="separate"/>
@@ -339,8 +339,8 @@
       </w:r>
       <w:r>
         <w:rPr>
-          <w:rFonts w:hint="default"/>
-          <w:lang w:val="en-US"/>
+          <w:rFonts w:hint="eastAsia"/>
+          <w:lang w:val="en-US" w:eastAsia="zh-CN"/>
         </w:rPr>
         <w:fldChar w:fldCharType="end"/>
       </w:r>
@@ -348,14 +348,14 @@
     <w:p>
       <w:pPr>
         <w:rPr>
-          <w:rFonts w:hint="default"/>
-          <w:lang w:val="en-US"/>
-        </w:rPr>
-      </w:pPr>
-      <w:r>
-        <w:rPr>
-          <w:rFonts w:hint="default"/>
-          <w:lang w:val="en-US"/>
+          <w:rFonts w:hint="eastAsia"/>
+          <w:lang w:val="en-US" w:eastAsia="zh-CN"/>
+        </w:rPr>
+      </w:pPr>
+      <w:r>
+        <w:rPr>
+          <w:rFonts w:hint="eastAsia"/>
+          <w:lang w:val="en-US" w:eastAsia="zh-CN"/>
         </w:rPr>
         <w:fldChar w:fldCharType="end"/>
       </w:r>
@@ -365,14 +365,14 @@
     <w:p>
       <w:pPr>
         <w:rPr>
-          <w:rFonts w:hint="default"/>
-          <w:lang w:val="en-US"/>
-        </w:rPr>
-      </w:pPr>
-      <w:r>
-        <w:rPr>
-          <w:rFonts w:hint="default"/>
-          <w:lang w:val="en-US"/>
+          <w:rFonts w:hint="eastAsia"/>
+          <w:lang w:val="en-US" w:eastAsia="zh-CN"/>
+        </w:rPr>
+      </w:pPr>
+      <w:r>
+        <w:rPr>
+          <w:rFonts w:hint="eastAsia"/>
+          <w:lang w:val="en-US" w:eastAsia="zh-CN"/>
         </w:rPr>
         <w:br w:type="page"/>
       </w:r>
@@ -382,15 +382,15 @@
         <w:pStyle w:val="24"/>
         <w:bidi w:val="0"/>
         <w:rPr>
-          <w:rFonts w:hint="default"/>
-          <w:lang w:val="en-US"/>
-        </w:rPr>
-      </w:pPr>
-      <w:bookmarkStart w:id="0" w:name="_Toc1487999153"/>
-      <w:r>
-        <w:rPr>
-          <w:rFonts w:hint="default"/>
-          <w:lang w:val="en-US"/>
+          <w:rFonts w:hint="eastAsia"/>
+          <w:lang w:val="en-US" w:eastAsia="zh-CN"/>
+        </w:rPr>
+      </w:pPr>
+      <w:bookmarkStart w:id="0" w:name="_Toc922968883"/>
+      <w:r>
+        <w:rPr>
+          <w:rFonts w:hint="eastAsia"/>
+          <w:lang w:val="en-US" w:eastAsia="zh-CN"/>
         </w:rPr>
         <w:t>2. 总体技术方案【P01】</w:t>
       </w:r>
@@ -401,14 +401,14 @@
         <w:pStyle w:val="11"/>
         <w:bidi w:val="0"/>
         <w:rPr>
-          <w:rFonts w:hint="default"/>
-          <w:lang w:val="en-US"/>
-        </w:rPr>
-      </w:pPr>
-      <w:r>
-        <w:rPr>
-          <w:rFonts w:hint="default"/>
-          <w:lang w:val="en-US"/>
+          <w:rFonts w:hint="eastAsia"/>
+          <w:lang w:val="en-US" w:eastAsia="zh-CN"/>
+        </w:rPr>
+      </w:pPr>
+      <w:r>
+        <w:rPr>
+          <w:rFonts w:hint="eastAsia"/>
+          <w:lang w:val="en-US" w:eastAsia="zh-CN"/>
         </w:rPr>
         <w:t>基于招标需求，数据管理平台按"采集—治理—服务"三层架构建设，覆盖全部业务域数据接入、清洗、建模与服务发布，与需求条目逐项对应（响应策略：实质性）。</w:t>
       </w:r>
@@ -418,15 +418,15 @@
         <w:pStyle w:val="24"/>
         <w:bidi w:val="0"/>
         <w:rPr>
-          <w:rFonts w:hint="default"/>
-          <w:lang w:val="en-US"/>
-        </w:rPr>
-      </w:pPr>
-      <w:bookmarkStart w:id="1" w:name="_Toc1354695156"/>
-      <w:r>
-        <w:rPr>
-          <w:rFonts w:hint="default"/>
-          <w:lang w:val="en-US"/>
+          <w:rFonts w:hint="eastAsia"/>
+          <w:lang w:val="en-US" w:eastAsia="zh-CN"/>
+        </w:rPr>
+      </w:pPr>
+      <w:bookmarkStart w:id="1" w:name="_Toc1063634300"/>
+      <w:r>
+        <w:rPr>
+          <w:rFonts w:hint="eastAsia"/>
+          <w:lang w:val="en-US" w:eastAsia="zh-CN"/>
         </w:rPr>
         <w:t>3. 数据平台架构与国产化适配【P02】</w:t>
       </w:r>
@@ -437,14 +437,14 @@
         <w:pStyle w:val="11"/>
         <w:bidi w:val="0"/>
         <w:rPr>
-          <w:rFonts w:hint="default"/>
-          <w:lang w:val="en-US"/>
-        </w:rPr>
-      </w:pPr>
-      <w:r>
-        <w:rPr>
-          <w:rFonts w:hint="default"/>
-          <w:lang w:val="en-US"/>
+          <w:rFonts w:hint="eastAsia"/>
+          <w:lang w:val="en-US" w:eastAsia="zh-CN"/>
+        </w:rPr>
+      </w:pPr>
+      <w:r>
+        <w:rPr>
+          <w:rFonts w:hint="eastAsia"/>
+          <w:lang w:val="en-US" w:eastAsia="zh-CN"/>
         </w:rPr>
         <w:t>架构采用存算分离 + 国产化适配层（术语见表 CONTEXT.md）。优势说明：在满足"支持国产数据库"的基础上，实现 PostgreSQL + 达梦双栈，适配层复用率 90%，较单栈方案降低切换成本（响应策略：正偏离）。</w:t>
       </w:r>
@@ -454,14 +454,14 @@
         <w:pStyle w:val="10"/>
         <w:bidi w:val="0"/>
         <w:rPr>
-          <w:rFonts w:hint="default"/>
-          <w:lang w:val="en-US"/>
-        </w:rPr>
-      </w:pPr>
-      <w:r>
-        <w:rPr>
-          <w:rFonts w:hint="default"/>
-          <w:lang w:val="en-US"/>
+          <w:rFonts w:hint="eastAsia"/>
+          <w:lang w:val="en-US" w:eastAsia="zh-CN"/>
+        </w:rPr>
+      </w:pPr>
+      <w:r>
+        <w:rPr>
+          <w:rFonts w:hint="eastAsia"/>
+          <w:lang w:val="en-US" w:eastAsia="zh-CN"/>
         </w:rPr>
         <w:t>国产化适配架构如图 1。</w:t>
       </w:r>
@@ -471,14 +471,14 @@
         <w:keepNext/>
         <w:jc w:val="center"/>
         <w:rPr>
-          <w:rFonts w:hint="default"/>
-          <w:lang w:val="en-US"/>
-        </w:rPr>
-      </w:pPr>
-      <w:r>
-        <w:rPr>
-          <w:rFonts w:hint="default"/>
-          <w:lang w:val="en-US"/>
+          <w:rFonts w:hint="eastAsia"/>
+          <w:lang w:val="en-US" w:eastAsia="zh-CN"/>
+        </w:rPr>
+      </w:pPr>
+      <w:r>
+        <w:rPr>
+          <w:rFonts w:hint="eastAsia"/>
+          <w:lang w:val="en-US" w:eastAsia="zh-CN"/>
         </w:rPr>
         <w:drawing>
           <wp:inline distT="0" distB="0" distL="114300" distR="114300">
@@ -524,14 +524,14 @@
         <w:pStyle w:val="15"/>
         <w:bidi w:val="0"/>
         <w:rPr>
-          <w:rFonts w:hint="default"/>
-          <w:lang w:val="en-US"/>
-        </w:rPr>
-      </w:pPr>
-      <w:r>
-        <w:rPr>
-          <w:rFonts w:hint="default"/>
-          <w:lang w:val="en-US"/>
+          <w:rFonts w:hint="eastAsia"/>
+          <w:lang w:val="en-US" w:eastAsia="zh-CN"/>
+        </w:rPr>
+      </w:pPr>
+      <w:r>
+        <w:rPr>
+          <w:rFonts w:hint="eastAsia"/>
+          <w:lang w:val="en-US" w:eastAsia="zh-CN"/>
         </w:rPr>
         <w:t>图 1 国产化适配架构</w:t>
       </w:r>
@@ -541,15 +541,15 @@
         <w:pStyle w:val="24"/>
         <w:bidi w:val="0"/>
         <w:rPr>
-          <w:rFonts w:hint="default"/>
-          <w:lang w:val="en-US"/>
-        </w:rPr>
-      </w:pPr>
-      <w:bookmarkStart w:id="2" w:name="_Toc739861398"/>
-      <w:r>
-        <w:rPr>
-          <w:rFonts w:hint="default"/>
-          <w:lang w:val="en-US"/>
+          <w:rFonts w:hint="eastAsia"/>
+          <w:lang w:val="en-US" w:eastAsia="zh-CN"/>
+        </w:rPr>
+      </w:pPr>
+      <w:bookmarkStart w:id="2" w:name="_Toc847802472"/>
+      <w:r>
+        <w:rPr>
+          <w:rFonts w:hint="eastAsia"/>
+          <w:lang w:val="en-US" w:eastAsia="zh-CN"/>
         </w:rPr>
         <w:t>4. 实施与保障方案【P02 辅助】</w:t>
       </w:r>
@@ -560,14 +560,14 @@
         <w:pStyle w:val="11"/>
         <w:bidi w:val="0"/>
         <w:rPr>
-          <w:rFonts w:hint="default"/>
-          <w:lang w:val="en-US"/>
-        </w:rPr>
-      </w:pPr>
-      <w:r>
-        <w:rPr>
-          <w:rFonts w:hint="default"/>
-          <w:lang w:val="en-US"/>
+          <w:rFonts w:hint="eastAsia"/>
+          <w:lang w:val="en-US" w:eastAsia="zh-CN"/>
+        </w:rPr>
+      </w:pPr>
+      <w:r>
+        <w:rPr>
+          <w:rFonts w:hint="eastAsia"/>
+          <w:lang w:val="en-US" w:eastAsia="zh-CN"/>
         </w:rPr>
         <w:t>两年工期分四阶段推进，每阶段设国产化适配层回归测试关卡。</w:t>
       </w:r>
@@ -577,15 +577,15 @@
         <w:pStyle w:val="24"/>
         <w:bidi w:val="0"/>
         <w:rPr>
-          <w:rFonts w:hint="default"/>
-          <w:lang w:val="en-US"/>
-        </w:rPr>
-      </w:pPr>
-      <w:bookmarkStart w:id="3" w:name="_Toc920200056"/>
-      <w:r>
-        <w:rPr>
-          <w:rFonts w:hint="default"/>
-          <w:lang w:val="en-US"/>
+          <w:rFonts w:hint="eastAsia"/>
+          <w:lang w:val="en-US" w:eastAsia="zh-CN"/>
+        </w:rPr>
+      </w:pPr>
+      <w:bookmarkStart w:id="3" w:name="_Toc462149059"/>
+      <w:r>
+        <w:rPr>
+          <w:rFonts w:hint="eastAsia"/>
+          <w:lang w:val="en-US" w:eastAsia="zh-CN"/>
         </w:rPr>
         <w:t>5. 项目团队与类似业绩【P03】</w:t>
       </w:r>
@@ -596,14 +596,14 @@
         <w:pStyle w:val="11"/>
         <w:bidi w:val="0"/>
         <w:rPr>
-          <w:rFonts w:hint="default"/>
-          <w:lang w:val="en-US"/>
-        </w:rPr>
-      </w:pPr>
-      <w:r>
-        <w:rPr>
-          <w:rFonts w:hint="default"/>
-          <w:lang w:val="en-US"/>
+          <w:rFonts w:hint="eastAsia"/>
+          <w:lang w:val="en-US" w:eastAsia="zh-CN"/>
+        </w:rPr>
+      </w:pPr>
+      <w:r>
+        <w:rPr>
+          <w:rFonts w:hint="eastAsia"/>
+          <w:lang w:val="en-US" w:eastAsia="zh-CN"/>
         </w:rPr>
         <w:t>架构师张工 [人员-P01]（12 年经验、双栈认证）领衔；类似业绩见 [案例-C01]：智慧园区数据平台，合同额 1200 万元，PostgreSQL + 达梦双栈，团队 15 人（响应策略：实质性）。</w:t>
       </w:r>
@@ -613,8 +613,8 @@
         <w:keepNext/>
         <w:jc w:val="center"/>
         <w:rPr>
-          <w:rFonts w:hint="default"/>
-          <w:lang w:val="en-US"/>
+          <w:rFonts w:hint="eastAsia"/>
+          <w:lang w:val="en-US" w:eastAsia="zh-CN"/>
         </w:rPr>
       </w:pPr>
     </w:p>
@@ -636,43 +636,49 @@
     <w:pPr>
       <w:pStyle w:val="2"/>
       <w:rPr>
-        <w:rFonts w:hint="default"/>
-        <w:lang w:val="en-US"/>
+        <w:rFonts w:hint="eastAsia" w:eastAsiaTheme="minorEastAsia"/>
+        <w:lang w:eastAsia="zh-CN"/>
       </w:rPr>
     </w:pPr>
     <w:r>
       <w:rPr>
-        <w:lang w:val="en-US"/>
+        <w:rFonts w:hint="eastAsia"/>
+        <w:lang w:eastAsia="zh-CN"/>
       </w:rPr>
       <w:t xml:space="preserve">Page </w:t>
     </w:r>
     <w:r>
       <w:rPr>
-        <w:lang w:val="en-US"/>
+        <w:rFonts w:hint="eastAsia"/>
+        <w:lang w:eastAsia="zh-CN"/>
       </w:rPr>
       <w:fldChar w:fldCharType="begin"/>
     </w:r>
     <w:r>
       <w:rPr>
-        <w:lang w:val="en-US"/>
+        <w:rFonts w:hint="eastAsia"/>
+        <w:lang w:eastAsia="zh-CN"/>
       </w:rPr>
       <w:instrText xml:space="preserve"> PAGE  \* MERGEFORMAT </w:instrText>
     </w:r>
     <w:r>
       <w:rPr>
-        <w:lang w:val="en-US"/>
+        <w:rFonts w:hint="eastAsia"/>
+        <w:lang w:eastAsia="zh-CN"/>
       </w:rPr>
       <w:fldChar w:fldCharType="separate"/>
     </w:r>
     <w:r>
       <w:rPr>
-        <w:lang w:val="en-US"/>
+        <w:rFonts w:hint="eastAsia"/>
+        <w:lang w:eastAsia="zh-CN"/>
       </w:rPr>
       <w:t>1</w:t>
     </w:r>
     <w:r>
       <w:rPr>
-        <w:lang w:val="en-US"/>
+        <w:rFonts w:hint="eastAsia"/>
+        <w:lang w:eastAsia="zh-CN"/>
       </w:rPr>
       <w:fldChar w:fldCharType="end"/>
     </w:r>

</xml_diff>